<commit_message>
Huck: revisão Parte 2
Co-Authored-By: Claude Opus 5.5 <noreply@anthropic.com>
Claude-Session: https://claude.ai/code/session_01MJjUEEZrxQDEUifKK2vj9g
</commit_message>
<xml_diff>
--- a/roteiros/luciano-huck/Huck_Parte2.docx
+++ b/roteiros/luciano-huck/Huck_Parte2.docx
@@ -31,7 +31,7 @@
         <w:rPr>
           <w:color w:val="000000"/>
         </w:rPr>
-        <w:t>Naquele ano, o Banco Master ainda vivia o melhor momento. Ninguém falava em crise. Ninguém falava em polícia. Para quem olhava de fora, Daniel Vorcaro era só mais um banqueiro bem-sucedido de São Paulo.</w:t>
+        <w:t>Naquele ano, o Banco Master ainda crescia sem chamar atenção. Ninguém falava em crise. Ninguém falava em polícia. Para quem olhava de fora, Daniel Vorcaro era só mais um banqueiro bem-sucedido de São Paulo.</w:t>
       </w:r>
     </w:p>
     <w:p>
@@ -55,7 +55,7 @@
         <w:rPr>
           <w:color w:val="000000"/>
         </w:rPr>
-        <w:t>Ninguém sabe exatamente onde foi, nem quem apresentou um ao outro. O que se sabe é o que aconteceu logo depois.</w:t>
+        <w:t>As reportagens não dizem onde foi, nem quem apresentou um ao outro. O que se sabe é o que aconteceu logo depois.</w:t>
       </w:r>
     </w:p>
     <w:p>
@@ -207,7 +207,7 @@
         <w:rPr>
           <w:color w:val="C00000"/>
         </w:rPr>
-        <w:t>Agora imagine por um momento que você está em casa, num domingo à tarde, assistindo Luciano Huck ajudar uma família a reformar a casa. E, sem saber, o homem na tela está combinando com um banqueiro dividir um avião de luxo. É esse contraste que deixou tanta gente desconfortável quando as mensagens apareceram.</w:t>
+        <w:t>Agora imagine por um momento que você está em casa, num domingo à tarde, assistindo Luciano Huck emocionado ao lado de uma família simples. E, sem saber, o homem na tela está combinando com um banqueiro dividir um avião de luxo. É esse contraste que deixou tanta gente desconfortável quando as mensagens apareceram.</w:t>
       </w:r>
     </w:p>
     <w:p>
@@ -255,7 +255,7 @@
         <w:rPr>
           <w:color w:val="000000"/>
         </w:rPr>
-        <w:t>Rios transbordaram. Cidades inteiras ficaram debaixo d'água. Em Canoas, na região metropolitana de Porto Alegre, bairros inteiros desapareceram sob a enchente. Gente foi resgatada de barco, dos telhados das casas.</w:t>
+        <w:t>Rios transbordaram. Cidades inteiras ficaram debaixo d'água. Em Canoas, na região metropolitana de Porto Alegre, bairros inteiros ficaram submersos. Gente foi resgatada de barco, dos telhados das casas.</w:t>
       </w:r>
     </w:p>
     <w:p>
@@ -375,7 +375,7 @@
         <w:rPr>
           <w:color w:val="000000"/>
         </w:rPr>
-        <w:t>As enchentes no Sul. A entrevista com um presidente em guerra. Dois dos momentos mais importantes da carreira recente de Luciano Huck tinham passado, de alguma forma, pelo jatinho do mesmo banqueiro.</w:t>
+        <w:t>As enchentes no Sul. A entrevista com um presidente em guerra. Dois momentos marcantes da carreira recente de Luciano Huck tinham passado, de alguma forma, pelo jatinho do mesmo banqueiro.</w:t>
       </w:r>
     </w:p>
     <w:p>
@@ -383,23 +383,7 @@
         <w:rPr>
           <w:color w:val="C00000"/>
         </w:rPr>
-        <w:t>Só que, até aqui, tudo isso ainda parece amizade. Favores entre dois homens ricos. O que transformou essas mensagens num escândalo começou numa negociação que envolvia o próprio Domingão. E um número que fez muita gente parar e ler de novo.</w:t>
-      </w:r>
-    </w:p>
-    <w:p>
-      <w:r>
-        <w:rPr>
-          <w:color w:val="000000"/>
-        </w:rPr>
-        <w:t>Do lado de fora, nada disso aparecia.</w:t>
-      </w:r>
-    </w:p>
-    <w:p>
-      <w:r>
-        <w:rPr>
-          <w:color w:val="000000"/>
-        </w:rPr>
-        <w:t>O público continuava vendo o mesmo Luciano Huck de sempre, aos domingos, sorrindo e abraçando as famílias.</w:t>
+        <w:t>Só que, até aqui, tudo isso ainda parece amizade. Favores entre dois homens ricos. O que transformou essas mensagens em polêmica começou numa negociação que envolvia o próprio Domingão. E um número que fez muita gente parar e ler de novo.</w:t>
       </w:r>
     </w:p>
     <w:p>

</xml_diff>